<commit_message>
Change 4: First Steps Fund: population served changed to children ages 3–6, preschool-aged children, and caregivers.
Independent test branch created directly from BASELINE v1-original
(a5b0342). Contains this change only.

Co-Authored-By: Claude Opus 5.5 <noreply@anthropic.com>
Claude-Session: https://claude.ai/code/session_01CQxLpwe1Pu1FJJBAM5jt5M
</commit_message>
<xml_diff>
--- a/documents-src/guidelines/cpcf-first-steps-infant-toddler-fund-2027-rfp.docx
+++ b/documents-src/guidelines/cpcf-first-steps-infant-toddler-fund-2027-rfp.docx
@@ -108,7 +108,7 @@
         <w:rPr>
           <w:i w:val="0"/>
         </w:rPr>
-        <w:t>The First Steps Infant &amp; Toddler Fund invests in the first three years of life, when a child's brain develops faster than at any other time. Created in 2014 by a coalition of Flagstaff families and now supported by more than 200 donors, the fund has granted more than $3.4 million to early childhood programs across the region.</w:t>
+        <w:t>The First Steps Infant &amp; Toddler Fund invests in the preschool years, supporting children ages 3–6 and the caregivers who raise them. Created in 2014 by a coalition of Flagstaff families and now supported by more than 200 donors, the fund has granted more than $3.4 million to early childhood programs across the region.</w:t>
       </w:r>
     </w:p>
     <w:p>
@@ -116,7 +116,7 @@
         <w:rPr>
           <w:i w:val="0"/>
         </w:rPr>
-        <w:t>The 2027 Request for Proposals reflects the findings of the Foundation's 2026 Northern Arizona Infant Care Gap brief, which found one licensed infant care slot for every five infants in the four-county region. Proposals that add licensed infant and toddler care capacity in Apache and Navajo counties are especially encouraged.</w:t>
+        <w:t>The 2027 Request for Proposals reflects the findings of the Foundation's 2026 Northern Arizona Infant Care Gap brief, which found one licensed infant care slot for every five infants in the four-county region. Proposals that add licensed care capacity for children ages 3–6 in Apache and Navajo counties are especially encouraged.</w:t>
       </w:r>
     </w:p>
     <w:p>
@@ -212,7 +212,7 @@
         <w:pStyle w:val="ListBullet"/>
       </w:pPr>
       <w:r>
-        <w:t>Infants and toddlers from birth to age three</w:t>
+        <w:t>Children ages 3–6</w:t>
       </w:r>
     </w:p>
     <w:p>
@@ -220,7 +220,7 @@
         <w:pStyle w:val="ListBullet"/>
       </w:pPr>
       <w:r>
-        <w:t>Expectant and parenting young adults ages 24 and under</w:t>
+        <w:t>Preschool-aged children</w:t>
       </w:r>
     </w:p>
     <w:p>
@@ -228,15 +228,7 @@
         <w:pStyle w:val="ListBullet"/>
       </w:pPr>
       <w:r>
-        <w:t>Grandparents and kin caregivers</w:t>
-      </w:r>
-    </w:p>
-    <w:p>
-      <w:pPr>
-        <w:pStyle w:val="ListBullet"/>
-      </w:pPr>
-      <w:r>
-        <w:t>Home-based and center-based early childhood educators</w:t>
+        <w:t>Caregivers</w:t>
       </w:r>
     </w:p>
     <w:p>
@@ -325,14 +317,6 @@
       </w:pPr>
       <w:r>
         <w:t>Individual child care tuition payments</w:t>
-      </w:r>
-    </w:p>
-    <w:p>
-      <w:pPr>
-        <w:pStyle w:val="ListBullet"/>
-      </w:pPr>
-      <w:r>
-        <w:t>Programs serving only children ages four and older</w:t>
       </w:r>
     </w:p>
     <w:p>

</xml_diff>

<commit_message>
Change 12: First Steps Fund: award notification date of April 16, 2027 added (replaces the previous 'announced by May 14, 2027' decision date).
Independent test branch created directly from BASELINE v1-original
(a5b0342). Contains this change only.

Co-Authored-By: Claude Opus 5.5 <noreply@anthropic.com>
Claude-Session: https://claude.ai/code/session_01CQxLpwe1Pu1FJJBAM5jt5M
</commit_message>
<xml_diff>
--- a/documents-src/guidelines/cpcf-first-steps-infant-toddler-fund-2027-rfp.docx
+++ b/documents-src/guidelines/cpcf-first-steps-infant-toddler-fund-2027-rfp.docx
@@ -600,7 +600,7 @@
                 <w:b/>
                 <w:sz w:val="19"/>
               </w:rPr>
-              <w:t>Decision</w:t>
+              <w:t>Award notification date</w:t>
             </w:r>
           </w:p>
         </w:tc>
@@ -617,7 +617,7 @@
               <w:rPr>
                 <w:sz w:val="19"/>
               </w:rPr>
-              <w:t>Award decisions announced by May 14, 2027</w:t>
+              <w:t>Friday, April 16, 2027</w:t>
             </w:r>
           </w:p>
         </w:tc>
@@ -754,7 +754,7 @@
         <w:t xml:space="preserve">5.  Decision. </w:t>
       </w:r>
       <w:r>
-        <w:t>Awards are announced by May 14, 2027, and funds are released in July.</w:t>
+        <w:t>Applicants are notified of award decisions on April 16, 2027, and funds are released in July.</w:t>
       </w:r>
     </w:p>
     <w:p>

</xml_diff>